<commit_message>
lamd complaint: complete transcription of FILED-EXAMPLE-complaint (fb-w0vj.1)
fb diff --content: G0 PASS (5 pages); G2 residuals template-driven (CIVIL ACTION NO. label, asterisk rule).
</commit_message>
<xml_diff>
--- a/courts/fifth-circuit/louisiana/federal/middle-district/complaint/usage/OUTPUT-complaint.docx
+++ b/courts/fifth-circuit/louisiana/federal/middle-district/complaint/usage/OUTPUT-complaint.docx
@@ -94,7 +94,28 @@
               <w:pStyle w:val="LamdCaptionRight"/>
             </w:pPr>
             <w:r>
-              <w:t xml:space="preserve">CIVIL ACTION NO. 3:25-cv-01162-SDD-EWD</w:t>
+              <w:t xml:space="preserve">CIVIL ACTION NO. 25-1162</w:t>
+            </w:r>
+          </w:p>
+          <w:p>
+            <w:pPr>
+              <w:pStyle w:val="LamdCaptionRight"/>
+            </w:pPr>
+          </w:p>
+          <w:p>
+            <w:pPr>
+              <w:pStyle w:val="LamdCaptionRight"/>
+            </w:pPr>
+            <w:r>
+              <w:t xml:space="preserve">JUDGE:</w:t>
+            </w:r>
+          </w:p>
+          <w:p>
+            <w:pPr>
+              <w:pStyle w:val="LamdCaptionRight"/>
+            </w:pPr>
+            <w:r>
+              <w:t xml:space="preserve">MAGISTRATE:</w:t>
             </w:r>
           </w:p>
         </w:tc>
@@ -134,14 +155,15 @@
         <w:t xml:space="preserve">Plaintiff, BEATRICE M. PARKER, through undersigned counsel, respectfully files this Complaint against Defendant BASF Corporation, and alleges as follows:</w:t>
       </w:r>
     </w:p>
-    <w:bookmarkStart w:id="20" w:name="i.-jurisdiction-and-venue"/>
     <w:p>
       <w:pPr>
         <w:pStyle w:val="Heading1"/>
       </w:pPr>
+      <w:bookmarkStart w:id="9" w:name="_6db30ae86b67dc27fe23e30cf999a50cf8a4616"/>
       <w:r>
         <w:t xml:space="preserve">I. JURISDICTION AND VENUE</w:t>
       </w:r>
+      <w:bookmarkEnd w:id="9"/>
     </w:p>
     <w:p>
       <w:pPr>
@@ -179,15 +201,15 @@
         <w:t xml:space="preserve">Venue is proper in the Middle District of Louisiana under 28 U.S.C. § 1391(b) because a substantial part of the events or omissions giving rise to this claim occurred in this District, including Plaintiff’s occupational and environmental exposure to ethylene oxide emitted from Defendant’s Geismar, Louisiana facility.</w:t>
       </w:r>
     </w:p>
-    <w:bookmarkEnd w:id="20"/>
-    <w:bookmarkStart w:id="21" w:name="ii.-parties"/>
     <w:p>
       <w:pPr>
         <w:pStyle w:val="Heading1"/>
       </w:pPr>
+      <w:bookmarkStart w:id="10" w:name="_523d9a1074ba7f646e9d4f3a3eba6a4f61454a8"/>
       <w:r>
         <w:t xml:space="preserve">II. PARTIES</w:t>
       </w:r>
+      <w:bookmarkEnd w:id="10"/>
     </w:p>
     <w:p>
       <w:pPr>
@@ -223,24 +245,25 @@
         <w:t xml:space="preserve">) is a foreign business corporation authorized to do business in Louisiana. BASF’s registered agent for service of process is: C T Corporation System, 3867 Plaza Tower Dr., Baton Rouge, LA 70816. BASF owns and operates a large chemical manufacturing complex in Geismar, Louisiana, which produces ethylene oxide and related chemical intermediates.</w:t>
       </w:r>
     </w:p>
-    <w:bookmarkEnd w:id="21"/>
-    <w:bookmarkStart w:id="27" w:name="iii.-factual-allegations"/>
     <w:p>
       <w:pPr>
         <w:pStyle w:val="Heading1"/>
       </w:pPr>
+      <w:bookmarkStart w:id="11" w:name="_655d947ed01267528ccbdc5fd89396b2bef0d06"/>
       <w:r>
         <w:t xml:space="preserve">III. FACTUAL ALLEGATIONS</w:t>
       </w:r>
-    </w:p>
-    <w:bookmarkStart w:id="22" w:name="a.-plaintiffs-employment-at-basf"/>
+      <w:bookmarkEnd w:id="11"/>
+    </w:p>
     <w:p>
       <w:pPr>
         <w:pStyle w:val="Heading3"/>
       </w:pPr>
+      <w:bookmarkStart w:id="12" w:name="_00dd06c499fb7a0b4d8a8c368622fb68d8e5e51"/>
       <w:r>
         <w:t xml:space="preserve">A. Plaintiff’s Employment at BASF</w:t>
       </w:r>
+      <w:bookmarkEnd w:id="12"/>
     </w:p>
     <w:p>
       <w:pPr>
@@ -304,15 +327,15 @@
         <w:t xml:space="preserve">Throughout her employment, BASF failed to provide adequate respiratory protection, failed to monitor EtO levels effectively, and failed to warn Plaintiff of the health risks associated with chronic EtO exposure.</w:t>
       </w:r>
     </w:p>
-    <w:bookmarkEnd w:id="22"/>
-    <w:bookmarkStart w:id="23" w:name="X737cd8d242c3e067287b940306b3825b32464f4"/>
     <w:p>
       <w:pPr>
         <w:pStyle w:val="Heading3"/>
       </w:pPr>
+      <w:bookmarkStart w:id="13" w:name="_737cd8d242c3e067287b940306b3825b32464f4"/>
       <w:r>
         <w:t xml:space="preserve">B. Whistleblower Retaliation and Termination</w:t>
       </w:r>
+      <w:bookmarkEnd w:id="13"/>
     </w:p>
     <w:p>
       <w:pPr>
@@ -356,15 +379,15 @@
         <w:t xml:space="preserve">In 1996, Plaintiff was constructively and creatively terminated from her position at BASF because of her protected activity.</w:t>
       </w:r>
     </w:p>
-    <w:bookmarkEnd w:id="23"/>
-    <w:bookmarkStart w:id="24" w:name="c.-cancer-diagnosis-and-medical-harm"/>
     <w:p>
       <w:pPr>
         <w:pStyle w:val="Heading3"/>
       </w:pPr>
+      <w:bookmarkStart w:id="14" w:name="_34854cc3367d7bf77bddc25f44d2b8a6c2cb7de"/>
       <w:r>
         <w:t xml:space="preserve">C. Cancer Diagnosis and Medical Harm</w:t>
       </w:r>
+      <w:bookmarkEnd w:id="14"/>
     </w:p>
     <w:p>
       <w:pPr>
@@ -408,15 +431,15 @@
         <w:t xml:space="preserve">Plaintiff’s cancer diagnosis and resulting surgeries were directly and proximately caused by her long-term occupational exposure to ethylene oxide at BASF’s Geismar facility.</w:t>
       </w:r>
     </w:p>
-    <w:bookmarkEnd w:id="24"/>
-    <w:bookmarkStart w:id="25" w:name="d.-impact-on-plaintiffs-life"/>
     <w:p>
       <w:pPr>
         <w:pStyle w:val="Heading3"/>
       </w:pPr>
+      <w:bookmarkStart w:id="15" w:name="_b9e984e7f54c7884f7559cc3736a320167ae78d"/>
       <w:r>
         <w:t xml:space="preserve">D. Impact on Plaintiff’s Life</w:t>
       </w:r>
+      <w:bookmarkEnd w:id="15"/>
     </w:p>
     <w:p>
       <w:pPr>
@@ -432,15 +455,15 @@
         <w:t xml:space="preserve">The physical and emotional trauma of losing both breasts caused profound psychological distress, body-image injury, and long-term emotional suffering.</w:t>
       </w:r>
     </w:p>
-    <w:bookmarkEnd w:id="25"/>
-    <w:bookmarkStart w:id="26" w:name="X9d952fe4ec2463777119d685b0ef397f960e82d"/>
     <w:p>
       <w:pPr>
         <w:pStyle w:val="Heading3"/>
       </w:pPr>
+      <w:bookmarkStart w:id="16" w:name="_9d952fe4ec2463777119d685b0ef397f960e82d"/>
       <w:r>
         <w:t xml:space="preserve">E. BASF’s Knowledge and Failure to Protect</w:t>
       </w:r>
+      <w:bookmarkEnd w:id="16"/>
     </w:p>
     <w:p>
       <w:pPr>
@@ -484,25 +507,25 @@
         <w:t xml:space="preserve">BASF’s conduct demonstrated reckless disregard for the health and safety of its employees and the surrounding community.</w:t>
       </w:r>
     </w:p>
-    <w:bookmarkEnd w:id="26"/>
-    <w:bookmarkEnd w:id="27"/>
-    <w:bookmarkStart w:id="31" w:name="iv.-causes-of-action"/>
     <w:p>
       <w:pPr>
         <w:pStyle w:val="Heading1"/>
       </w:pPr>
+      <w:bookmarkStart w:id="17" w:name="_d581b65b9bd68ee823bff59cbfd3324231b03cd"/>
       <w:r>
         <w:t xml:space="preserve">IV. CAUSES OF ACTION</w:t>
       </w:r>
-    </w:p>
-    <w:bookmarkStart w:id="28" w:name="count-1-negligence"/>
+      <w:bookmarkEnd w:id="17"/>
+    </w:p>
     <w:p>
       <w:pPr>
         <w:pStyle w:val="Heading2"/>
       </w:pPr>
+      <w:bookmarkStart w:id="18" w:name="_e897acbca38f3d973c7d9d0e2a207237ab3bc26"/>
       <w:r>
         <w:t xml:space="preserve">COUNT 1 – NEGLIGENCE</w:t>
       </w:r>
+      <w:bookmarkEnd w:id="18"/>
     </w:p>
     <w:p>
       <w:pPr>
@@ -560,15 +583,15 @@
         <w:t xml:space="preserve">BASF’s negligence was the direct and proximate cause of Plaintiff’s cancer and resulting injuries.</w:t>
       </w:r>
     </w:p>
-    <w:bookmarkEnd w:id="28"/>
-    <w:bookmarkStart w:id="29" w:name="X0c568ba26e01307bdb2d5eb1d834a9ad0ba3a1b"/>
     <w:p>
       <w:pPr>
         <w:pStyle w:val="Heading2"/>
       </w:pPr>
+      <w:bookmarkStart w:id="19" w:name="_0c568ba26e01307bdb2d5eb1d834a9ad0ba3a1b"/>
       <w:r>
         <w:t xml:space="preserve">COUNT 2 – STRICT LIABILITY (ULTRAHAZARDOUS ACTIVITY)</w:t>
       </w:r>
+      <w:bookmarkEnd w:id="19"/>
     </w:p>
     <w:p>
       <w:pPr>
@@ -612,15 +635,15 @@
         <w:t xml:space="preserve">BASF is strictly liable for damages caused by its EtO emissions.</w:t>
       </w:r>
     </w:p>
-    <w:bookmarkEnd w:id="29"/>
-    <w:bookmarkStart w:id="30" w:name="count-3-failure-to-warn"/>
     <w:p>
       <w:pPr>
         <w:pStyle w:val="Heading2"/>
       </w:pPr>
+      <w:bookmarkStart w:id="20" w:name="_fcea62f3a011dda5182ed59fa5e9eba2af08bca"/>
       <w:r>
         <w:t xml:space="preserve">COUNT 3 – FAILURE TO WARN</w:t>
       </w:r>
+      <w:bookmarkEnd w:id="20"/>
     </w:p>
     <w:p>
       <w:pPr>
@@ -664,16 +687,15 @@
         <w:t xml:space="preserve">BASF failed to warn Plaintiff of the risks associated with EtO exposure during her employment.</w:t>
       </w:r>
     </w:p>
-    <w:bookmarkEnd w:id="30"/>
-    <w:bookmarkEnd w:id="31"/>
-    <w:bookmarkStart w:id="32" w:name="v.-damages"/>
     <w:p>
       <w:pPr>
         <w:pStyle w:val="Heading1"/>
       </w:pPr>
+      <w:bookmarkStart w:id="21" w:name="_d8e7b3697821046459dee56a18fa6e0bf5cf66e"/>
       <w:r>
         <w:t xml:space="preserve">V. DAMAGES</w:t>
       </w:r>
+      <w:bookmarkEnd w:id="21"/>
     </w:p>
     <w:p>
       <w:pPr>
@@ -815,15 +837,15 @@
         <w:t xml:space="preserve">Plaintiff seeks all damages available under Louisiana and federal law.</w:t>
       </w:r>
     </w:p>
-    <w:bookmarkEnd w:id="32"/>
-    <w:bookmarkStart w:id="33" w:name="vi.-prayer-for-relief"/>
     <w:p>
       <w:pPr>
         <w:pStyle w:val="Heading1"/>
       </w:pPr>
+      <w:bookmarkStart w:id="22" w:name="_778cb286f414d24ed0e1c898f1fd2ec0cb209a5"/>
       <w:r>
         <w:t xml:space="preserve">VI. PRAYER FOR RELIEF</w:t>
       </w:r>
+      <w:bookmarkEnd w:id="22"/>
     </w:p>
     <w:p>
       <w:pPr>
@@ -929,9 +951,6 @@
         <w:pStyle w:val="LamdSignature"/>
         <w:keepNext/>
       </w:pPr>
-      <w:r>
-        <w:t xml:space="preserve">BY: ______________________________</w:t>
-      </w:r>
     </w:p>
     <w:p>
       <w:pPr>
@@ -939,7 +958,7 @@
         <w:keepNext/>
       </w:pPr>
       <w:r>
-        <w:t xml:space="preserve">JANICE MONTAGUE-MYLES</w:t>
+        <w:t xml:space="preserve">BY: ____________________________</w:t>
       </w:r>
     </w:p>
     <w:p>
@@ -948,7 +967,7 @@
         <w:keepNext/>
       </w:pPr>
       <w:r>
-        <w:t xml:space="preserve">Bar Roll No. 18356</w:t>
+        <w:t xml:space="preserve">JANICE MONTAGUE-MYLES</w:t>
       </w:r>
     </w:p>
     <w:p>
@@ -957,7 +976,7 @@
         <w:keepNext/>
       </w:pPr>
       <w:r>
-        <w:t xml:space="preserve">23445 Railroad Avenue</w:t>
+        <w:t xml:space="preserve">Bar Roll#: 18356</w:t>
       </w:r>
     </w:p>
     <w:p>
@@ -966,7 +985,7 @@
         <w:keepNext/>
       </w:pPr>
       <w:r>
-        <w:t xml:space="preserve">Plaquemine, Louisiana 70764</w:t>
+        <w:t xml:space="preserve">23445 Railroad Avenue</w:t>
       </w:r>
     </w:p>
     <w:p>
@@ -975,7 +994,7 @@
         <w:keepNext/>
       </w:pPr>
       <w:r>
-        <w:t xml:space="preserve">Phone: (225) 382-5222</w:t>
+        <w:t xml:space="preserve">Plaquemine, Louisiana 70764</w:t>
       </w:r>
     </w:p>
     <w:p>
@@ -984,6 +1003,15 @@
         <w:keepNext/>
       </w:pPr>
       <w:r>
+        <w:t xml:space="preserve">Phone: (225) 382-5222</w:t>
+      </w:r>
+    </w:p>
+    <w:p>
+      <w:pPr>
+        <w:pStyle w:val="LamdSignature"/>
+        <w:keepNext/>
+      </w:pPr>
+      <w:r>
         <w:t xml:space="preserve">Facsimile: (225) 382-5202</w:t>
       </w:r>
     </w:p>
@@ -995,14 +1023,13 @@
         <w:t xml:space="preserve">janicemyles@att.net</w:t>
       </w:r>
     </w:p>
-    <w:bookmarkEnd w:id="33"/>
     <w:sectPr>
-      <w:footerReference r:id="rId9" w:type="default"/>
+      <w:footerReference w:type="default" r:id="rIdLamdFooter1"/>
       <w:footnotePr>
         <w:numRestart w:val="eachSect"/>
       </w:footnotePr>
-      <w:pgSz w:h="15840" w:w="12240"/>
-      <w:pgMar w:bottom="1440" w:footer="864" w:gutter="0" w:header="720" w:left="1440" w:right="1440" w:top="1440"/>
+      <w:pgSz w:w="12240" w:h="15840"/>
+      <w:pgMar w:top="1440" w:right="1440" w:bottom="1440" w:left="1440" w:header="720" w:footer="864" w:gutter="0"/>
     </w:sectPr>
   </w:body>
 </w:document>
@@ -1145,20 +1172,20 @@
   <w:docDefaults>
     <w:rPrDefault>
       <w:rPr>
-        <w:rFonts w:ascii="EB Garamond" w:cs="EB Garamond" w:eastAsia="EB Garamond" w:hAnsi="EB Garamond"/>
+        <w:rFonts w:ascii="EB Garamond" w:hAnsi="EB Garamond" w:eastAsia="EB Garamond" w:cs="EB Garamond"/>
         <w:sz w:val="24"/>
         <w:szCs w:val="24"/>
-        <w:lang w:bidi="ar-SA" w:eastAsia="en-US" w:val="en-US"/>
+        <w:lang w:val="en-US" w:eastAsia="en-US" w:bidi="ar-SA"/>
       </w:rPr>
     </w:rPrDefault>
     <w:pPrDefault>
       <w:pPr>
-        <w:spacing w:after="0" w:before="0" w:line="480" w:lineRule="exact"/>
+        <w:spacing w:before="0" w:after="0" w:line="480" w:lineRule="exact"/>
       </w:pPr>
     </w:pPrDefault>
   </w:docDefaults>
-  <w:latentStyles w:count="276" w:defLockedState="0" w:defQFormat="0" w:defSemiHidden="0" w:defUIPriority="0" w:defUnhideWhenUsed="0"/>
-  <w:style w:styleId="Title" w:type="paragraph">
+  <w:latentStyles w:defLockedState="0" w:defUIPriority="0" w:defSemiHidden="0" w:defUnhideWhenUsed="0" w:defQFormat="0" w:count="276"/>
+  <w:style w:type="paragraph" w:styleId="Title">
     <w:name w:val="Title"/>
     <w:basedOn w:val="Normal"/>
     <w:next w:val="BodyText"/>
@@ -1177,7 +1204,7 @@
       <w:szCs w:val="56"/>
     </w:rPr>
   </w:style>
-  <w:style w:customStyle="1" w:styleId="TitleChar" w:type="character">
+  <w:style w:type="character" w:customStyle="1" w:styleId="TitleChar">
     <w:name w:val="Title Char"/>
     <w:basedOn w:val="DefaultParagraphFont"/>
     <w:link w:val="Title"/>
@@ -1189,7 +1216,7 @@
       <w:szCs w:val="56"/>
     </w:rPr>
   </w:style>
-  <w:style w:styleId="Subtitle" w:type="paragraph">
+  <w:style w:type="paragraph" w:styleId="Subtitle">
     <w:name w:val="Subtitle"/>
     <w:basedOn w:val="Title"/>
     <w:next w:val="BodyText"/>
@@ -1209,7 +1236,7 @@
       <w:szCs w:val="28"/>
     </w:rPr>
   </w:style>
-  <w:style w:customStyle="1" w:styleId="SubtitleChar" w:type="character">
+  <w:style w:type="character" w:customStyle="1" w:styleId="SubtitleChar">
     <w:name w:val="Subtitle Char"/>
     <w:basedOn w:val="DefaultParagraphFont"/>
     <w:link w:val="Subtitle"/>
@@ -1223,7 +1250,7 @@
       <w:szCs w:val="28"/>
     </w:rPr>
   </w:style>
-  <w:style w:customStyle="1" w:styleId="Author" w:type="paragraph">
+  <w:style w:type="paragraph" w:customStyle="1" w:styleId="Author">
     <w:name w:val="Author"/>
     <w:basedOn w:val="Title"/>
     <w:next w:val="BodyText"/>
@@ -1237,7 +1264,7 @@
       <w:szCs w:val="24"/>
     </w:rPr>
   </w:style>
-  <w:style w:styleId="Date" w:type="paragraph">
+  <w:style w:type="paragraph" w:styleId="Date">
     <w:name w:val="Date"/>
     <w:basedOn w:val="Title"/>
     <w:next w:val="BodyText"/>
@@ -1251,7 +1278,7 @@
       <w:szCs w:val="24"/>
     </w:rPr>
   </w:style>
-  <w:style w:customStyle="1" w:styleId="AbstractTitle" w:type="paragraph">
+  <w:style w:type="paragraph" w:customStyle="1" w:styleId="AbstractTitle">
     <w:name w:val="Abstract Title"/>
     <w:basedOn w:val="Normal"/>
     <w:next w:val="Abstract"/>
@@ -1259,7 +1286,7 @@
     <w:pPr>
       <w:keepNext/>
       <w:keepLines/>
-      <w:spacing w:after="0" w:before="300"/>
+      <w:spacing w:before="300" w:after="0"/>
       <w:jc w:val="center"/>
     </w:pPr>
     <w:rPr>
@@ -1268,7 +1295,7 @@
       <w:szCs w:val="20"/>
     </w:rPr>
   </w:style>
-  <w:style w:customStyle="1" w:styleId="Abstract" w:type="paragraph">
+  <w:style w:type="paragraph" w:customStyle="1" w:styleId="Abstract">
     <w:name w:val="Abstract"/>
     <w:basedOn w:val="Normal"/>
     <w:next w:val="BodyText"/>
@@ -1276,14 +1303,14 @@
     <w:pPr>
       <w:keepNext/>
       <w:keepLines/>
-      <w:spacing w:after="300" w:before="100"/>
+      <w:spacing w:before="100" w:after="300"/>
     </w:pPr>
     <w:rPr>
       <w:sz w:val="20"/>
       <w:szCs w:val="20"/>
     </w:rPr>
   </w:style>
-  <w:style w:styleId="Bibliography" w:type="paragraph">
+  <w:style w:type="paragraph" w:styleId="Bibliography">
     <w:name w:val="Bibliography"/>
     <w:basedOn w:val="Normal"/>
     <w:next w:val="Bibliography"/>
@@ -1291,7 +1318,7 @@
     <w:pPr/>
     <w:rPr/>
   </w:style>
-  <w:style w:styleId="Heading4" w:type="paragraph">
+  <w:style w:type="paragraph" w:styleId="Heading4">
     <w:name w:val="heading 4"/>
     <w:basedOn w:val="Normal"/>
     <w:next w:val="BodyText"/>
@@ -1304,7 +1331,7 @@
     <w:pPr>
       <w:keepNext/>
       <w:keepLines/>
-      <w:spacing w:after="40" w:before="80"/>
+      <w:spacing w:before="80" w:after="40"/>
       <w:outlineLvl w:val="3"/>
     </w:pPr>
     <w:rPr>
@@ -1314,7 +1341,7 @@
       <w:color w:val="0F4761"/>
     </w:rPr>
   </w:style>
-  <w:style w:styleId="Heading5" w:type="paragraph">
+  <w:style w:type="paragraph" w:styleId="Heading5">
     <w:name w:val="heading 5"/>
     <w:basedOn w:val="Normal"/>
     <w:next w:val="BodyText"/>
@@ -1327,7 +1354,7 @@
     <w:pPr>
       <w:keepNext/>
       <w:keepLines/>
-      <w:spacing w:after="40" w:before="80"/>
+      <w:spacing w:before="80" w:after="40"/>
       <w:outlineLvl w:val="4"/>
     </w:pPr>
     <w:rPr>
@@ -1335,7 +1362,7 @@
       <w:color w:val="0F4761"/>
     </w:rPr>
   </w:style>
-  <w:style w:styleId="Heading6" w:type="paragraph">
+  <w:style w:type="paragraph" w:styleId="Heading6">
     <w:name w:val="heading 6"/>
     <w:basedOn w:val="Normal"/>
     <w:next w:val="BodyText"/>
@@ -1348,7 +1375,7 @@
     <w:pPr>
       <w:keepNext/>
       <w:keepLines/>
-      <w:spacing w:after="0" w:before="40"/>
+      <w:spacing w:before="40" w:after="0"/>
       <w:outlineLvl w:val="5"/>
     </w:pPr>
     <w:rPr>
@@ -1358,7 +1385,7 @@
       <w:color w:val="595959"/>
     </w:rPr>
   </w:style>
-  <w:style w:styleId="Heading7" w:type="paragraph">
+  <w:style w:type="paragraph" w:styleId="Heading7">
     <w:name w:val="heading 7"/>
     <w:basedOn w:val="Normal"/>
     <w:next w:val="BodyText"/>
@@ -1371,7 +1398,7 @@
     <w:pPr>
       <w:keepNext/>
       <w:keepLines/>
-      <w:spacing w:after="0" w:before="40"/>
+      <w:spacing w:before="40" w:after="0"/>
       <w:outlineLvl w:val="6"/>
     </w:pPr>
     <w:rPr>
@@ -1379,7 +1406,7 @@
       <w:color w:val="595959"/>
     </w:rPr>
   </w:style>
-  <w:style w:styleId="Heading8" w:type="paragraph">
+  <w:style w:type="paragraph" w:styleId="Heading8">
     <w:name w:val="heading 8"/>
     <w:basedOn w:val="Normal"/>
     <w:next w:val="BodyText"/>
@@ -1402,7 +1429,7 @@
       <w:color w:val="272727"/>
     </w:rPr>
   </w:style>
-  <w:style w:styleId="Heading9" w:type="paragraph">
+  <w:style w:type="paragraph" w:styleId="Heading9">
     <w:name w:val="heading 9"/>
     <w:basedOn w:val="Normal"/>
     <w:next w:val="BodyText"/>
@@ -1423,7 +1450,7 @@
       <w:color w:val="272727"/>
     </w:rPr>
   </w:style>
-  <w:style w:customStyle="1" w:styleId="Heading1Char" w:type="character">
+  <w:style w:type="character" w:customStyle="1" w:styleId="Heading1Char">
     <w:name w:val="Heading 1 Char"/>
     <w:basedOn w:val="DefaultParagraphFont"/>
     <w:link w:val="Heading1"/>
@@ -1436,7 +1463,7 @@
       <w:szCs w:val="40"/>
     </w:rPr>
   </w:style>
-  <w:style w:customStyle="1" w:styleId="Heading2Char" w:type="character">
+  <w:style w:type="character" w:customStyle="1" w:styleId="Heading2Char">
     <w:name w:val="Heading 2 Char"/>
     <w:basedOn w:val="DefaultParagraphFont"/>
     <w:link w:val="Heading2"/>
@@ -1450,7 +1477,7 @@
       <w:szCs w:val="32"/>
     </w:rPr>
   </w:style>
-  <w:style w:customStyle="1" w:styleId="Heading3Char" w:type="character">
+  <w:style w:type="character" w:customStyle="1" w:styleId="Heading3Char">
     <w:name w:val="Heading 3 Char"/>
     <w:basedOn w:val="DefaultParagraphFont"/>
     <w:link w:val="Heading3"/>
@@ -1464,7 +1491,7 @@
       <w:szCs w:val="28"/>
     </w:rPr>
   </w:style>
-  <w:style w:customStyle="1" w:styleId="Heading4Char" w:type="character">
+  <w:style w:type="character" w:customStyle="1" w:styleId="Heading4Char">
     <w:name w:val="Heading 4 Char"/>
     <w:basedOn w:val="DefaultParagraphFont"/>
     <w:link w:val="Heading4"/>
@@ -1478,7 +1505,7 @@
       <w:color w:val="0F4761"/>
     </w:rPr>
   </w:style>
-  <w:style w:customStyle="1" w:styleId="Heading5Char" w:type="character">
+  <w:style w:type="character" w:customStyle="1" w:styleId="Heading5Char">
     <w:name w:val="Heading 5 Char"/>
     <w:basedOn w:val="DefaultParagraphFont"/>
     <w:link w:val="Heading5"/>
@@ -1490,7 +1517,7 @@
       <w:color w:val="0F4761"/>
     </w:rPr>
   </w:style>
-  <w:style w:customStyle="1" w:styleId="Heading6Char" w:type="character">
+  <w:style w:type="character" w:customStyle="1" w:styleId="Heading6Char">
     <w:name w:val="Heading 6 Char"/>
     <w:basedOn w:val="DefaultParagraphFont"/>
     <w:link w:val="Heading6"/>
@@ -1504,7 +1531,7 @@
       <w:color w:val="595959"/>
     </w:rPr>
   </w:style>
-  <w:style w:customStyle="1" w:styleId="Heading7Char" w:type="character">
+  <w:style w:type="character" w:customStyle="1" w:styleId="Heading7Char">
     <w:name w:val="Heading 7 Char"/>
     <w:basedOn w:val="DefaultParagraphFont"/>
     <w:link w:val="Heading7"/>
@@ -1516,7 +1543,7 @@
       <w:color w:val="595959"/>
     </w:rPr>
   </w:style>
-  <w:style w:customStyle="1" w:styleId="Heading8Char" w:type="character">
+  <w:style w:type="character" w:customStyle="1" w:styleId="Heading8Char">
     <w:name w:val="Heading 8 Char"/>
     <w:basedOn w:val="DefaultParagraphFont"/>
     <w:link w:val="Heading8"/>
@@ -1530,7 +1557,7 @@
       <w:color w:val="272727"/>
     </w:rPr>
   </w:style>
-  <w:style w:customStyle="1" w:styleId="Heading9Char" w:type="character">
+  <w:style w:type="character" w:customStyle="1" w:styleId="Heading9Char">
     <w:name w:val="Heading 9 Char"/>
     <w:basedOn w:val="DefaultParagraphFont"/>
     <w:link w:val="Heading9"/>
@@ -1542,7 +1569,7 @@
       <w:color w:val="272727"/>
     </w:rPr>
   </w:style>
-  <w:style w:styleId="BlockText" w:type="paragraph">
+  <w:style w:type="paragraph" w:styleId="BlockText">
     <w:name w:val="Block Text"/>
     <w:basedOn w:val="BodyText"/>
     <w:next w:val="BodyText"/>
@@ -1550,11 +1577,11 @@
     <w:unhideWhenUsed/>
     <w:qFormat/>
     <w:pPr>
-      <w:spacing w:after="100" w:before="100"/>
+      <w:spacing w:before="100" w:after="100"/>
       <w:ind w:firstLine="0" w:left="480" w:right="480"/>
     </w:pPr>
   </w:style>
-  <w:style w:styleId="FootnoteBlockText" w:type="paragraph">
+  <w:style w:type="paragraph" w:styleId="FootnoteBlockText">
     <w:name w:val="Footnote Block Text"/>
     <w:basedOn w:val="FootnoteText"/>
     <w:next w:val="FootnoteText"/>
@@ -1562,34 +1589,34 @@
     <w:unhideWhenUsed/>
     <w:qFormat/>
     <w:pPr>
-      <w:spacing w:after="100" w:before="100"/>
+      <w:spacing w:before="100" w:after="100"/>
       <w:ind w:firstLine="0" w:left="480" w:right="480"/>
     </w:pPr>
   </w:style>
-  <w:style w:default="1" w:styleId="DefaultParagraphFont" w:type="character">
+  <w:style w:type="character" w:default="1" w:styleId="DefaultParagraphFont">
     <w:name w:val="Default Paragraph Font"/>
     <w:semiHidden/>
     <w:unhideWhenUsed/>
   </w:style>
-  <w:style w:default="1" w:styleId="Table" w:type="table">
+  <w:style w:type="table" w:default="1" w:styleId="Table">
     <w:name w:val="Table"/>
     <w:basedOn w:val="TableNormal"/>
     <w:semiHidden/>
     <w:unhideWhenUsed/>
     <w:qFormat/>
     <w:tblPr>
-      <w:tblInd w:type="dxa" w:w="0"/>
+      <w:tblInd w:w="0" w:type="dxa"/>
       <w:tblCellMar>
-        <w:top w:type="dxa" w:w="0"/>
-        <w:left w:type="dxa" w:w="108"/>
-        <w:bottom w:type="dxa" w:w="0"/>
-        <w:right w:type="dxa" w:w="108"/>
+        <w:top w:w="0" w:type="dxa"/>
+        <w:left w:w="108" w:type="dxa"/>
+        <w:bottom w:w="0" w:type="dxa"/>
+        <w:right w:w="108" w:type="dxa"/>
       </w:tblCellMar>
     </w:tblPr>
     <w:tblStylePr w:type="firstRow">
       <w:tblPr>
         <w:jc w:val="left"/>
-        <w:tblInd w:type="dxa" w:w="0"/>
+        <w:tblInd w:w="0" w:type="dxa"/>
       </w:tblPr>
       <w:trPr>
         <w:jc w:val="left"/>
@@ -1602,7 +1629,7 @@
       </w:tcPr>
     </w:tblStylePr>
   </w:style>
-  <w:style w:customStyle="1" w:styleId="DefinitionTerm" w:type="paragraph">
+  <w:style w:type="paragraph" w:customStyle="1" w:styleId="DefinitionTerm">
     <w:name w:val="Definition Term"/>
     <w:basedOn w:val="Normal"/>
     <w:next w:val="Definition"/>
@@ -1615,49 +1642,49 @@
       <w:b/>
     </w:rPr>
   </w:style>
-  <w:style w:customStyle="1" w:styleId="Definition" w:type="paragraph">
+  <w:style w:type="paragraph" w:customStyle="1" w:styleId="Definition">
     <w:name w:val="Definition"/>
     <w:basedOn w:val="Normal"/>
   </w:style>
-  <w:style w:styleId="Caption" w:type="paragraph">
+  <w:style w:type="paragraph" w:styleId="Caption">
     <w:name w:val="Caption"/>
     <w:basedOn w:val="Normal"/>
     <w:link w:val="BodyTextChar"/>
     <w:pPr>
-      <w:spacing w:after="120" w:before="0"/>
+      <w:spacing w:before="0" w:after="120"/>
     </w:pPr>
     <w:rPr>
       <w:i/>
     </w:rPr>
   </w:style>
-  <w:style w:customStyle="1" w:styleId="TableCaption" w:type="paragraph">
+  <w:style w:type="paragraph" w:customStyle="1" w:styleId="TableCaption">
     <w:name w:val="Table Caption"/>
     <w:basedOn w:val="Caption"/>
     <w:pPr>
       <w:keepNext/>
     </w:pPr>
   </w:style>
-  <w:style w:customStyle="1" w:styleId="ImageCaption" w:type="paragraph">
+  <w:style w:type="paragraph" w:customStyle="1" w:styleId="ImageCaption">
     <w:name w:val="Image Caption"/>
     <w:basedOn w:val="Caption"/>
   </w:style>
-  <w:style w:customStyle="1" w:styleId="Figure" w:type="paragraph">
+  <w:style w:type="paragraph" w:customStyle="1" w:styleId="Figure">
     <w:name w:val="Figure"/>
     <w:basedOn w:val="Normal"/>
   </w:style>
-  <w:style w:customStyle="1" w:styleId="CaptionedFigure" w:type="paragraph">
+  <w:style w:type="paragraph" w:customStyle="1" w:styleId="CaptionedFigure">
     <w:name w:val="Captioned Figure"/>
     <w:basedOn w:val="Figure"/>
     <w:pPr>
       <w:keepNext/>
     </w:pPr>
   </w:style>
-  <w:style w:customStyle="1" w:styleId="BodyTextChar" w:type="character">
+  <w:style w:type="character" w:customStyle="1" w:styleId="BodyTextChar">
     <w:name w:val="Body Text Char"/>
     <w:basedOn w:val="DefaultParagraphFont"/>
     <w:link w:val="BodyText"/>
   </w:style>
-  <w:style w:customStyle="1" w:styleId="VerbatimChar" w:type="character">
+  <w:style w:type="character" w:customStyle="1" w:styleId="VerbatimChar">
     <w:name w:val="Verbatim Char"/>
     <w:basedOn w:val="BodyTextChar"/>
     <w:rPr>
@@ -1665,25 +1692,25 @@
       <w:sz w:val="22"/>
     </w:rPr>
   </w:style>
-  <w:style w:customStyle="1" w:styleId="SectionNumber" w:type="character">
+  <w:style w:type="character" w:customStyle="1" w:styleId="SectionNumber">
     <w:name w:val="Section Number"/>
     <w:basedOn w:val="BodyTextChar"/>
   </w:style>
-  <w:style w:styleId="FootnoteReference" w:type="character">
+  <w:style w:type="character" w:styleId="FootnoteReference">
     <w:name w:val="Footnote Reference"/>
     <w:basedOn w:val="BodyTextChar"/>
     <w:rPr>
       <w:vertAlign w:val="superscript"/>
     </w:rPr>
   </w:style>
-  <w:style w:styleId="Hyperlink" w:type="character">
+  <w:style w:type="character" w:styleId="Hyperlink">
     <w:name w:val="Hyperlink"/>
     <w:basedOn w:val="BodyTextChar"/>
     <w:rPr>
       <w:color w:val="4F81BD"/>
     </w:rPr>
   </w:style>
-  <w:style w:styleId="TOCHeading" w:type="paragraph">
+  <w:style w:type="paragraph" w:styleId="TOCHeading">
     <w:name w:val="TOC Heading"/>
     <w:basedOn w:val="Heading1"/>
     <w:next w:val="BodyText"/>
@@ -1701,46 +1728,46 @@
       <w:color w:val="365F91"/>
     </w:rPr>
   </w:style>
-  <w:style w:default="1" w:styleId="Normal" w:type="paragraph">
+  <w:style w:type="paragraph" w:default="1" w:styleId="Normal">
     <w:name w:val="Normal"/>
     <w:qFormat/>
     <w:pPr>
       <w:widowControl/>
-      <w:spacing w:after="0" w:before="0" w:line="480" w:lineRule="exact"/>
-      <w:ind w:firstLine="0" w:left="0"/>
+      <w:spacing w:before="0" w:after="0" w:line="480" w:lineRule="exact"/>
+      <w:ind w:left="0" w:firstLine="0"/>
       <w:jc w:val="left"/>
     </w:pPr>
     <w:rPr>
-      <w:rFonts w:ascii="EB Garamond" w:cs="EB Garamond" w:eastAsia="EB Garamond" w:hAnsi="EB Garamond"/>
+      <w:rFonts w:ascii="EB Garamond" w:hAnsi="EB Garamond" w:eastAsia="EB Garamond" w:cs="EB Garamond"/>
       <w:sz w:val="24"/>
       <w:szCs w:val="24"/>
     </w:rPr>
   </w:style>
-  <w:style w:styleId="BodyText" w:type="paragraph">
+  <w:style w:type="paragraph" w:styleId="BodyText">
     <w:name w:val="Body Text"/>
     <w:basedOn w:val="Normal"/>
     <w:qFormat/>
     <w:pPr>
-      <w:spacing w:after="0" w:before="0" w:line="480" w:lineRule="exact"/>
+      <w:spacing w:before="0" w:after="0" w:line="480" w:lineRule="exact"/>
       <w:ind w:firstLine="720"/>
     </w:pPr>
   </w:style>
-  <w:style w:styleId="FirstParagraph" w:type="paragraph">
+  <w:style w:type="paragraph" w:styleId="FirstParagraph">
     <w:name w:val="First Paragraph"/>
     <w:basedOn w:val="BodyText"/>
     <w:next w:val="BodyText"/>
     <w:qFormat/>
   </w:style>
-  <w:style w:styleId="Compact" w:type="paragraph">
+  <w:style w:type="paragraph" w:styleId="Compact">
     <w:name w:val="Compact"/>
     <w:basedOn w:val="BodyText"/>
     <w:qFormat/>
     <w:pPr>
-      <w:spacing w:after="0" w:before="0" w:line="480" w:lineRule="exact"/>
+      <w:spacing w:before="0" w:after="0" w:line="480" w:lineRule="exact"/>
       <w:ind w:firstLine="0"/>
     </w:pPr>
   </w:style>
-  <w:style w:styleId="Heading1" w:type="paragraph">
+  <w:style w:type="paragraph" w:styleId="Heading1">
     <w:name w:val="heading 1"/>
     <w:basedOn w:val="Normal"/>
     <w:next w:val="BodyText"/>
@@ -1749,13 +1776,13 @@
     <w:pPr>
       <w:keepNext/>
       <w:keepLines/>
-      <w:spacing w:after="130" w:before="130" w:line="480" w:lineRule="exact"/>
-      <w:ind w:firstLine="0" w:left="0"/>
+      <w:spacing w:before="130" w:after="130" w:line="480" w:lineRule="exact"/>
+      <w:ind w:left="0" w:firstLine="0"/>
       <w:jc w:val="center"/>
       <w:outlineLvl w:val="0"/>
     </w:pPr>
     <w:rPr>
-      <w:rFonts w:ascii="EB Garamond" w:cs="EB Garamond" w:eastAsia="EB Garamond" w:hAnsi="EB Garamond"/>
+      <w:rFonts w:ascii="EB Garamond" w:hAnsi="EB Garamond" w:eastAsia="EB Garamond" w:cs="EB Garamond"/>
       <w:b/>
       <w:bCs/>
       <w:caps/>
@@ -1764,7 +1791,7 @@
       <w:szCs w:val="24"/>
     </w:rPr>
   </w:style>
-  <w:style w:styleId="Heading2" w:type="paragraph">
+  <w:style w:type="paragraph" w:styleId="Heading2">
     <w:name w:val="heading 2"/>
     <w:basedOn w:val="Normal"/>
     <w:next w:val="BodyText"/>
@@ -1774,13 +1801,13 @@
     <w:pPr>
       <w:keepNext/>
       <w:keepLines/>
-      <w:spacing w:after="130" w:before="130" w:line="480" w:lineRule="exact"/>
-      <w:ind w:firstLine="0" w:left="0"/>
+      <w:spacing w:before="130" w:after="130" w:line="480" w:lineRule="exact"/>
+      <w:ind w:left="0" w:firstLine="0"/>
       <w:jc w:val="center"/>
       <w:outlineLvl w:val="1"/>
     </w:pPr>
     <w:rPr>
-      <w:rFonts w:ascii="EB Garamond" w:cs="EB Garamond" w:eastAsia="EB Garamond" w:hAnsi="EB Garamond"/>
+      <w:rFonts w:ascii="EB Garamond" w:hAnsi="EB Garamond" w:eastAsia="EB Garamond" w:cs="EB Garamond"/>
       <w:b/>
       <w:bCs/>
       <w:color w:val="000000"/>
@@ -1788,7 +1815,7 @@
       <w:szCs w:val="24"/>
     </w:rPr>
   </w:style>
-  <w:style w:styleId="Heading3" w:type="paragraph">
+  <w:style w:type="paragraph" w:styleId="Heading3">
     <w:name w:val="heading 3"/>
     <w:basedOn w:val="Normal"/>
     <w:next w:val="BodyText"/>
@@ -1798,13 +1825,13 @@
     <w:pPr>
       <w:keepNext/>
       <w:keepLines/>
-      <w:spacing w:after="130" w:before="130" w:line="480" w:lineRule="exact"/>
-      <w:ind w:firstLine="0" w:left="0"/>
+      <w:spacing w:before="130" w:after="130" w:line="480" w:lineRule="exact"/>
+      <w:ind w:left="0" w:firstLine="0"/>
       <w:jc w:val="left"/>
       <w:outlineLvl w:val="2"/>
     </w:pPr>
     <w:rPr>
-      <w:rFonts w:ascii="EB Garamond" w:cs="EB Garamond" w:eastAsia="EB Garamond" w:hAnsi="EB Garamond"/>
+      <w:rFonts w:ascii="EB Garamond" w:hAnsi="EB Garamond" w:eastAsia="EB Garamond" w:cs="EB Garamond"/>
       <w:b/>
       <w:bCs/>
       <w:color w:val="000000"/>
@@ -1812,13 +1839,13 @@
       <w:szCs w:val="24"/>
     </w:rPr>
   </w:style>
-  <w:style w:styleId="FootnoteText" w:type="paragraph">
+  <w:style w:type="paragraph" w:styleId="FootnoteText">
     <w:name w:val="Footnote Text"/>
     <w:basedOn w:val="Normal"/>
     <w:uiPriority w:val="99"/>
     <w:unhideWhenUsed/>
     <w:pPr>
-      <w:spacing w:after="120" w:before="0" w:line="276" w:lineRule="exact"/>
+      <w:spacing w:before="0" w:after="120" w:line="276" w:lineRule="exact"/>
       <w:ind w:firstLine="0"/>
     </w:pPr>
     <w:rPr>
@@ -1826,13 +1853,13 @@
       <w:szCs w:val="20"/>
     </w:rPr>
   </w:style>
-  <w:style w:styleId="Footer" w:type="paragraph">
+  <w:style w:type="paragraph" w:styleId="Footer">
     <w:name w:val="footer"/>
     <w:basedOn w:val="Normal"/>
     <w:uiPriority w:val="99"/>
     <w:unhideWhenUsed/>
     <w:pPr>
-      <w:spacing w:after="0" w:before="0" w:line="240" w:lineRule="auto"/>
+      <w:spacing w:before="0" w:after="0" w:line="240" w:lineRule="auto"/>
       <w:ind w:firstLine="0"/>
       <w:jc w:val="center"/>
     </w:pPr>
@@ -1841,21 +1868,21 @@
       <w:szCs w:val="24"/>
     </w:rPr>
   </w:style>
-  <w:style w:customStyle="1" w:styleId="LamdBlank" w:type="paragraph">
+  <w:style w:type="paragraph" w:customStyle="1" w:styleId="LamdBlank">
     <w:name w:val="Lamd Blank"/>
     <w:basedOn w:val="Normal"/>
     <w:qFormat/>
     <w:pPr>
-      <w:spacing w:after="0" w:before="0" w:line="324" w:lineRule="exact"/>
+      <w:spacing w:before="0" w:after="0" w:line="324" w:lineRule="exact"/>
       <w:ind w:firstLine="0"/>
     </w:pPr>
   </w:style>
-  <w:style w:customStyle="1" w:styleId="LamdCourt" w:type="paragraph">
+  <w:style w:type="paragraph" w:customStyle="1" w:styleId="LamdCourt">
     <w:name w:val="Lamd Court"/>
     <w:basedOn w:val="Normal"/>
     <w:qFormat/>
     <w:pPr>
-      <w:spacing w:after="0" w:before="0" w:line="480" w:lineRule="exact"/>
+      <w:spacing w:before="0" w:after="0" w:line="480" w:lineRule="exact"/>
       <w:ind w:firstLine="0"/>
       <w:jc w:val="center"/>
     </w:pPr>
@@ -1864,14 +1891,14 @@
       <w:bCs/>
     </w:rPr>
   </w:style>
-  <w:style w:customStyle="1" w:styleId="LamdTitle" w:type="paragraph">
+  <w:style w:type="paragraph" w:customStyle="1" w:styleId="LamdTitle">
     <w:name w:val="Lamd Title"/>
     <w:basedOn w:val="Normal"/>
     <w:qFormat/>
     <w:pPr>
       <w:keepNext/>
       <w:keepLines/>
-      <w:spacing w:after="0" w:before="0" w:line="480" w:lineRule="exact"/>
+      <w:spacing w:before="0" w:after="0" w:line="480" w:lineRule="exact"/>
       <w:ind w:firstLine="0"/>
       <w:jc w:val="center"/>
     </w:pPr>
@@ -1881,56 +1908,56 @@
       <w:caps/>
     </w:rPr>
   </w:style>
-  <w:style w:customStyle="1" w:styleId="LamdSubtitle" w:type="paragraph">
+  <w:style w:type="paragraph" w:customStyle="1" w:styleId="LamdSubtitle">
     <w:name w:val="Lamd Subtitle"/>
     <w:basedOn w:val="Normal"/>
     <w:qFormat/>
     <w:pPr>
       <w:keepNext/>
       <w:keepLines/>
-      <w:spacing w:after="0" w:before="0" w:line="480" w:lineRule="exact"/>
+      <w:spacing w:before="0" w:after="0" w:line="480" w:lineRule="exact"/>
       <w:ind w:firstLine="0"/>
       <w:jc w:val="center"/>
     </w:pPr>
   </w:style>
-  <w:style w:customStyle="1" w:styleId="LamdCaption" w:type="paragraph">
+  <w:style w:type="paragraph" w:customStyle="1" w:styleId="LamdCaption">
     <w:name w:val="Lamd Caption"/>
     <w:basedOn w:val="Normal"/>
     <w:qFormat/>
     <w:pPr>
-      <w:spacing w:after="0" w:before="0" w:line="276" w:lineRule="exact"/>
+      <w:spacing w:before="0" w:after="0" w:line="276" w:lineRule="exact"/>
       <w:ind w:firstLine="0"/>
     </w:pPr>
   </w:style>
-  <w:style w:customStyle="1" w:styleId="LamdCaptionRight" w:type="paragraph">
+  <w:style w:type="paragraph" w:customStyle="1" w:styleId="LamdCaptionRight">
     <w:name w:val="Lamd Caption Right"/>
     <w:basedOn w:val="LamdCaption"/>
     <w:qFormat/>
     <w:pPr>
-      <w:ind w:firstLine="0" w:left="432"/>
-    </w:pPr>
-  </w:style>
-  <w:style w:customStyle="1" w:styleId="LamdSignature" w:type="paragraph">
+      <w:ind w:left="432" w:firstLine="0"/>
+    </w:pPr>
+  </w:style>
+  <w:style w:type="paragraph" w:customStyle="1" w:styleId="LamdSignature">
     <w:name w:val="Lamd Signature"/>
     <w:basedOn w:val="LamdCaption"/>
     <w:qFormat/>
     <w:pPr>
       <w:keepLines/>
-      <w:ind w:firstLine="0" w:left="4320"/>
-    </w:pPr>
-  </w:style>
-  <w:style w:customStyle="1" w:styleId="LamdNumbered" w:type="paragraph">
+      <w:ind w:left="4320" w:firstLine="0"/>
+    </w:pPr>
+  </w:style>
+  <w:style w:type="paragraph" w:customStyle="1" w:styleId="LamdNumbered">
     <w:name w:val="Lamd Numbered"/>
     <w:basedOn w:val="BodyText"/>
     <w:qFormat/>
     <w:pPr>
       <w:tabs>
-        <w:tab w:pos="1440" w:val="left"/>
+        <w:tab w:val="left" w:pos="1440"/>
       </w:tabs>
       <w:ind w:firstLine="720"/>
     </w:pPr>
   </w:style>
-  <w:style w:customStyle="1" w:styleId="LamdNumberedKeep" w:type="paragraph">
+  <w:style w:type="paragraph" w:customStyle="1" w:styleId="LamdNumberedKeep">
     <w:name w:val="Lamd Numbered Keep"/>
     <w:basedOn w:val="LamdNumbered"/>
     <w:qFormat/>
@@ -1939,19 +1966,19 @@
       <w:keepLines/>
     </w:pPr>
   </w:style>
-  <w:style w:customStyle="1" w:styleId="LamdList" w:type="paragraph">
+  <w:style w:type="paragraph" w:customStyle="1" w:styleId="LamdList">
     <w:name w:val="Lamd List"/>
     <w:basedOn w:val="Normal"/>
     <w:qFormat/>
     <w:pPr>
       <w:tabs>
-        <w:tab w:pos="1440" w:val="left"/>
+        <w:tab w:val="left" w:pos="1440"/>
       </w:tabs>
-      <w:spacing w:after="0" w:before="0" w:line="480" w:lineRule="exact"/>
-      <w:ind w:hanging="720" w:left="1440"/>
-    </w:pPr>
-  </w:style>
-  <w:style w:customStyle="1" w:styleId="LamdListKeep" w:type="paragraph">
+      <w:spacing w:before="0" w:after="0" w:line="480" w:lineRule="exact"/>
+      <w:ind w:left="1440" w:hanging="720"/>
+    </w:pPr>
+  </w:style>
+  <w:style w:type="paragraph" w:customStyle="1" w:styleId="LamdListKeep">
     <w:name w:val="Lamd List Keep"/>
     <w:basedOn w:val="LamdList"/>
     <w:qFormat/>
@@ -1960,7 +1987,7 @@
       <w:keepLines/>
     </w:pPr>
   </w:style>
-  <w:style w:customStyle="1" w:styleId="LamdBodyKeep" w:type="paragraph">
+  <w:style w:type="paragraph" w:customStyle="1" w:styleId="LamdBodyKeep">
     <w:name w:val="Lamd Body Keep"/>
     <w:basedOn w:val="BodyText"/>
     <w:qFormat/>

</xml_diff>